<commit_message>
Added week 3 exercises
</commit_message>
<xml_diff>
--- a/week 3/module-6/1. spring rest handson solutions/hands on 1/Hands on 1.docx
+++ b/week 3/module-6/1. spring rest handson solutions/hands on 1/Hands on 1.docx
@@ -76,7 +76,7 @@
         </w:rPr>
         <w:t>Go to </w:t>
       </w:r>
-      <w:hyperlink r:id="rId5" w:history="1">
+      <w:hyperlink r:id="rId7" w:history="1">
         <w:r>
           <w:rPr>
             <w:rStyle w:val="Hyperlink"/>
@@ -185,6 +185,7 @@
       </w:pPr>
       <w:r>
         <w:rPr>
+          <w:noProof/>
           <w:lang w:val="en-US"/>
         </w:rPr>
         <w:drawing>
@@ -203,7 +204,7 @@
                     <pic:cNvPicPr/>
                   </pic:nvPicPr>
                   <pic:blipFill>
-                    <a:blip r:embed="rId6"/>
+                    <a:blip r:embed="rId8"/>
                     <a:stretch>
                       <a:fillRect/>
                     </a:stretch>
@@ -331,13 +332,14 @@
       </w:pPr>
       <w:r>
         <w:rPr>
+          <w:noProof/>
           <w:lang w:val="en-US"/>
         </w:rPr>
         <w:drawing>
-          <wp:inline distT="0" distB="0" distL="0" distR="0" wp14:anchorId="40C8FD27" wp14:editId="79EDD671">
-            <wp:extent cx="5731510" cy="2552065"/>
-            <wp:effectExtent l="0" t="0" r="2540" b="635"/>
-            <wp:docPr id="1770240598" name="Picture 1"/>
+          <wp:inline distT="0" distB="0" distL="0" distR="0" wp14:anchorId="6FBB6E56" wp14:editId="711C103B">
+            <wp:extent cx="5731510" cy="2483485"/>
+            <wp:effectExtent l="0" t="0" r="2540" b="0"/>
+            <wp:docPr id="1049455526" name="Picture 1"/>
             <wp:cNvGraphicFramePr>
               <a:graphicFrameLocks xmlns:a="http://schemas.openxmlformats.org/drawingml/2006/main" noChangeAspect="1"/>
             </wp:cNvGraphicFramePr>
@@ -345,11 +347,11 @@
               <a:graphicData uri="http://schemas.openxmlformats.org/drawingml/2006/picture">
                 <pic:pic xmlns:pic="http://schemas.openxmlformats.org/drawingml/2006/picture">
                   <pic:nvPicPr>
-                    <pic:cNvPr id="1770240598" name=""/>
+                    <pic:cNvPr id="1049455526" name=""/>
                     <pic:cNvPicPr/>
                   </pic:nvPicPr>
                   <pic:blipFill>
-                    <a:blip r:embed="rId7"/>
+                    <a:blip r:embed="rId9"/>
                     <a:stretch>
                       <a:fillRect/>
                     </a:stretch>
@@ -357,7 +359,7 @@
                   <pic:spPr>
                     <a:xfrm>
                       <a:off x="0" y="0"/>
-                      <a:ext cx="5731510" cy="2552065"/>
+                      <a:ext cx="5731510" cy="2483485"/>
                     </a:xfrm>
                     <a:prstGeom prst="rect">
                       <a:avLst/>
@@ -473,6 +475,7 @@
       </w:pPr>
       <w:r>
         <w:rPr>
+          <w:noProof/>
           <w:lang w:val="en-US"/>
         </w:rPr>
         <w:drawing>
@@ -491,7 +494,7 @@
                     <pic:cNvPicPr/>
                   </pic:nvPicPr>
                   <pic:blipFill>
-                    <a:blip r:embed="rId8"/>
+                    <a:blip r:embed="rId10"/>
                     <a:stretch>
                       <a:fillRect/>
                     </a:stretch>
@@ -702,15 +705,368 @@
     </w:p>
     <w:p>
       <w:pPr>
-        <w:rPr>
-          <w:lang w:val="en-US"/>
-        </w:rPr>
-      </w:pPr>
+        <w:ind w:left="1080"/>
+        <w:rPr>
+          <w:lang w:val="en-US"/>
+        </w:rPr>
+      </w:pPr>
+    </w:p>
+    <w:p>
+      <w:pPr>
+        <w:ind w:left="1080"/>
+        <w:rPr>
+          <w:lang w:val="en-US"/>
+        </w:rPr>
+      </w:pPr>
+    </w:p>
+    <w:p>
+      <w:pPr>
+        <w:ind w:left="1080"/>
+        <w:rPr>
+          <w:lang w:val="en-US"/>
+        </w:rPr>
+      </w:pPr>
+    </w:p>
+    <w:p>
+      <w:pPr>
+        <w:ind w:left="1080"/>
+        <w:rPr>
+          <w:lang w:val="en-US"/>
+        </w:rPr>
+      </w:pPr>
+    </w:p>
+    <w:p>
+      <w:pPr>
+        <w:ind w:left="1080"/>
+        <w:rPr>
+          <w:lang w:val="en-US"/>
+        </w:rPr>
+      </w:pPr>
+    </w:p>
+    <w:p>
+      <w:pPr>
+        <w:ind w:left="1080"/>
+        <w:rPr>
+          <w:lang w:val="en-US"/>
+        </w:rPr>
+      </w:pPr>
+    </w:p>
+    <w:p>
+      <w:pPr>
+        <w:ind w:left="1080"/>
+        <w:rPr>
+          <w:lang w:val="en-US"/>
+        </w:rPr>
+      </w:pPr>
+    </w:p>
+    <w:p>
+      <w:pPr>
+        <w:ind w:left="720"/>
+        <w:rPr>
+          <w:lang w:val="en-US"/>
+        </w:rPr>
+      </w:pPr>
+      <w:r>
+        <w:rPr>
+          <w:lang w:val="en-US"/>
+        </w:rPr>
+        <w:t xml:space="preserve">Here is the dependency </w:t>
+      </w:r>
+      <w:proofErr w:type="gramStart"/>
+      <w:r>
+        <w:rPr>
+          <w:lang w:val="en-US"/>
+        </w:rPr>
+        <w:t>hierarchy:-</w:t>
+      </w:r>
+      <w:proofErr w:type="gramEnd"/>
+      <w:r>
+        <w:rPr>
+          <w:lang w:val="en-US"/>
+        </w:rPr>
+        <w:t xml:space="preserve"> </w:t>
+      </w:r>
+    </w:p>
+    <w:p>
+      <w:pPr>
+        <w:ind w:left="1080"/>
+        <w:rPr>
+          <w:lang w:val="en-US"/>
+        </w:rPr>
+      </w:pPr>
+      <w:r>
+        <w:rPr>
+          <w:noProof/>
+          <w:lang w:val="en-US"/>
+        </w:rPr>
+        <w:lastRenderedPageBreak/>
+        <w:drawing>
+          <wp:anchor distT="0" distB="0" distL="114300" distR="114300" simplePos="0" relativeHeight="251658240" behindDoc="1" locked="0" layoutInCell="1" allowOverlap="1" wp14:anchorId="75F9722D" wp14:editId="683E28FB">
+            <wp:simplePos x="0" y="0"/>
+            <wp:positionH relativeFrom="margin">
+              <wp:align>right</wp:align>
+            </wp:positionH>
+            <wp:positionV relativeFrom="paragraph">
+              <wp:posOffset>3810</wp:posOffset>
+            </wp:positionV>
+            <wp:extent cx="5356918" cy="4168140"/>
+            <wp:effectExtent l="0" t="0" r="0" b="3810"/>
+            <wp:wrapNone/>
+            <wp:docPr id="501073685" name="Picture 1"/>
+            <wp:cNvGraphicFramePr>
+              <a:graphicFrameLocks xmlns:a="http://schemas.openxmlformats.org/drawingml/2006/main" noChangeAspect="1"/>
+            </wp:cNvGraphicFramePr>
+            <a:graphic xmlns:a="http://schemas.openxmlformats.org/drawingml/2006/main">
+              <a:graphicData uri="http://schemas.openxmlformats.org/drawingml/2006/picture">
+                <pic:pic xmlns:pic="http://schemas.openxmlformats.org/drawingml/2006/picture">
+                  <pic:nvPicPr>
+                    <pic:cNvPr id="501073685" name=""/>
+                    <pic:cNvPicPr/>
+                  </pic:nvPicPr>
+                  <pic:blipFill>
+                    <a:blip r:embed="rId11">
+                      <a:extLst>
+                        <a:ext uri="{28A0092B-C50C-407E-A947-70E740481C1C}">
+                          <a14:useLocalDpi xmlns:a14="http://schemas.microsoft.com/office/drawing/2010/main" val="0"/>
+                        </a:ext>
+                      </a:extLst>
+                    </a:blip>
+                    <a:stretch>
+                      <a:fillRect/>
+                    </a:stretch>
+                  </pic:blipFill>
+                  <pic:spPr>
+                    <a:xfrm>
+                      <a:off x="0" y="0"/>
+                      <a:ext cx="5356918" cy="4168140"/>
+                    </a:xfrm>
+                    <a:prstGeom prst="rect">
+                      <a:avLst/>
+                    </a:prstGeom>
+                  </pic:spPr>
+                </pic:pic>
+              </a:graphicData>
+            </a:graphic>
+            <wp14:sizeRelH relativeFrom="margin">
+              <wp14:pctWidth>0</wp14:pctWidth>
+            </wp14:sizeRelH>
+            <wp14:sizeRelV relativeFrom="margin">
+              <wp14:pctHeight>0</wp14:pctHeight>
+            </wp14:sizeRelV>
+          </wp:anchor>
+        </w:drawing>
+      </w:r>
+    </w:p>
+    <w:p>
+      <w:pPr>
+        <w:ind w:left="1080"/>
+        <w:rPr>
+          <w:lang w:val="en-US"/>
+        </w:rPr>
+      </w:pPr>
+    </w:p>
+    <w:p>
+      <w:pPr>
+        <w:ind w:left="1080"/>
+        <w:rPr>
+          <w:lang w:val="en-US"/>
+        </w:rPr>
+      </w:pPr>
+    </w:p>
+    <w:p>
+      <w:pPr>
+        <w:rPr>
+          <w:lang w:val="en-US"/>
+        </w:rPr>
+      </w:pPr>
+      <w:r>
+        <w:rPr>
+          <w:noProof/>
+          <w:lang w:val="en-US"/>
+        </w:rPr>
+        <w:drawing>
+          <wp:anchor distT="0" distB="0" distL="114300" distR="114300" simplePos="0" relativeHeight="251660288" behindDoc="1" locked="0" layoutInCell="1" allowOverlap="1" wp14:anchorId="01F19585" wp14:editId="4ED439DE">
+            <wp:simplePos x="0" y="0"/>
+            <wp:positionH relativeFrom="margin">
+              <wp:align>right</wp:align>
+            </wp:positionH>
+            <wp:positionV relativeFrom="paragraph">
+              <wp:posOffset>7955915</wp:posOffset>
+            </wp:positionV>
+            <wp:extent cx="5349240" cy="537845"/>
+            <wp:effectExtent l="0" t="0" r="3810" b="0"/>
+            <wp:wrapNone/>
+            <wp:docPr id="1558798033" name="Picture 1"/>
+            <wp:cNvGraphicFramePr>
+              <a:graphicFrameLocks xmlns:a="http://schemas.openxmlformats.org/drawingml/2006/main" noChangeAspect="1"/>
+            </wp:cNvGraphicFramePr>
+            <a:graphic xmlns:a="http://schemas.openxmlformats.org/drawingml/2006/main">
+              <a:graphicData uri="http://schemas.openxmlformats.org/drawingml/2006/picture">
+                <pic:pic xmlns:pic="http://schemas.openxmlformats.org/drawingml/2006/picture">
+                  <pic:nvPicPr>
+                    <pic:cNvPr id="1558798033" name=""/>
+                    <pic:cNvPicPr/>
+                  </pic:nvPicPr>
+                  <pic:blipFill>
+                    <a:blip r:embed="rId12">
+                      <a:extLst>
+                        <a:ext uri="{28A0092B-C50C-407E-A947-70E740481C1C}">
+                          <a14:useLocalDpi xmlns:a14="http://schemas.microsoft.com/office/drawing/2010/main" val="0"/>
+                        </a:ext>
+                      </a:extLst>
+                    </a:blip>
+                    <a:stretch>
+                      <a:fillRect/>
+                    </a:stretch>
+                  </pic:blipFill>
+                  <pic:spPr>
+                    <a:xfrm>
+                      <a:off x="0" y="0"/>
+                      <a:ext cx="5349240" cy="537845"/>
+                    </a:xfrm>
+                    <a:prstGeom prst="rect">
+                      <a:avLst/>
+                    </a:prstGeom>
+                  </pic:spPr>
+                </pic:pic>
+              </a:graphicData>
+            </a:graphic>
+            <wp14:sizeRelH relativeFrom="margin">
+              <wp14:pctWidth>0</wp14:pctWidth>
+            </wp14:sizeRelH>
+            <wp14:sizeRelV relativeFrom="margin">
+              <wp14:pctHeight>0</wp14:pctHeight>
+            </wp14:sizeRelV>
+          </wp:anchor>
+        </w:drawing>
+      </w:r>
+      <w:r>
+        <w:rPr>
+          <w:noProof/>
+          <w:lang w:val="en-US"/>
+        </w:rPr>
+        <w:drawing>
+          <wp:anchor distT="0" distB="0" distL="114300" distR="114300" simplePos="0" relativeHeight="251659264" behindDoc="1" locked="0" layoutInCell="1" allowOverlap="1" wp14:anchorId="39592D62" wp14:editId="164A65E0">
+            <wp:simplePos x="0" y="0"/>
+            <wp:positionH relativeFrom="margin">
+              <wp:align>right</wp:align>
+            </wp:positionH>
+            <wp:positionV relativeFrom="paragraph">
+              <wp:posOffset>3315335</wp:posOffset>
+            </wp:positionV>
+            <wp:extent cx="5356860" cy="4639328"/>
+            <wp:effectExtent l="0" t="0" r="0" b="8890"/>
+            <wp:wrapNone/>
+            <wp:docPr id="1661238135" name="Picture 1"/>
+            <wp:cNvGraphicFramePr>
+              <a:graphicFrameLocks xmlns:a="http://schemas.openxmlformats.org/drawingml/2006/main" noChangeAspect="1"/>
+            </wp:cNvGraphicFramePr>
+            <a:graphic xmlns:a="http://schemas.openxmlformats.org/drawingml/2006/main">
+              <a:graphicData uri="http://schemas.openxmlformats.org/drawingml/2006/picture">
+                <pic:pic xmlns:pic="http://schemas.openxmlformats.org/drawingml/2006/picture">
+                  <pic:nvPicPr>
+                    <pic:cNvPr id="1661238135" name=""/>
+                    <pic:cNvPicPr/>
+                  </pic:nvPicPr>
+                  <pic:blipFill>
+                    <a:blip r:embed="rId13">
+                      <a:extLst>
+                        <a:ext uri="{28A0092B-C50C-407E-A947-70E740481C1C}">
+                          <a14:useLocalDpi xmlns:a14="http://schemas.microsoft.com/office/drawing/2010/main" val="0"/>
+                        </a:ext>
+                      </a:extLst>
+                    </a:blip>
+                    <a:stretch>
+                      <a:fillRect/>
+                    </a:stretch>
+                  </pic:blipFill>
+                  <pic:spPr>
+                    <a:xfrm>
+                      <a:off x="0" y="0"/>
+                      <a:ext cx="5356860" cy="4639328"/>
+                    </a:xfrm>
+                    <a:prstGeom prst="rect">
+                      <a:avLst/>
+                    </a:prstGeom>
+                  </pic:spPr>
+                </pic:pic>
+              </a:graphicData>
+            </a:graphic>
+            <wp14:sizeRelH relativeFrom="margin">
+              <wp14:pctWidth>0</wp14:pctWidth>
+            </wp14:sizeRelH>
+            <wp14:sizeRelV relativeFrom="margin">
+              <wp14:pctHeight>0</wp14:pctHeight>
+            </wp14:sizeRelV>
+          </wp:anchor>
+        </w:drawing>
+      </w:r>
       <w:r>
         <w:rPr>
           <w:lang w:val="en-US"/>
         </w:rPr>
         <w:br w:type="page"/>
+      </w:r>
+    </w:p>
+    <w:p>
+      <w:pPr>
+        <w:rPr>
+          <w:lang w:val="en-US"/>
+        </w:rPr>
+      </w:pPr>
+      <w:r>
+        <w:rPr>
+          <w:lang w:val="en-US"/>
+        </w:rPr>
+        <w:lastRenderedPageBreak/>
+        <w:t>Testing the application using a test class:</w:t>
+      </w:r>
+    </w:p>
+    <w:p>
+      <w:pPr>
+        <w:rPr>
+          <w:lang w:val="en-US"/>
+        </w:rPr>
+      </w:pPr>
+      <w:r>
+        <w:rPr>
+          <w:lang w:val="en-US"/>
+        </w:rPr>
+        <w:drawing>
+          <wp:inline distT="0" distB="0" distL="0" distR="0" wp14:anchorId="76DF09ED" wp14:editId="1885F502">
+            <wp:extent cx="6125401" cy="2903220"/>
+            <wp:effectExtent l="0" t="0" r="8890" b="0"/>
+            <wp:docPr id="1764570399" name="Picture 1"/>
+            <wp:cNvGraphicFramePr>
+              <a:graphicFrameLocks xmlns:a="http://schemas.openxmlformats.org/drawingml/2006/main" noChangeAspect="1"/>
+            </wp:cNvGraphicFramePr>
+            <a:graphic xmlns:a="http://schemas.openxmlformats.org/drawingml/2006/main">
+              <a:graphicData uri="http://schemas.openxmlformats.org/drawingml/2006/picture">
+                <pic:pic xmlns:pic="http://schemas.openxmlformats.org/drawingml/2006/picture">
+                  <pic:nvPicPr>
+                    <pic:cNvPr id="1764570399" name=""/>
+                    <pic:cNvPicPr/>
+                  </pic:nvPicPr>
+                  <pic:blipFill>
+                    <a:blip r:embed="rId14"/>
+                    <a:stretch>
+                      <a:fillRect/>
+                    </a:stretch>
+                  </pic:blipFill>
+                  <pic:spPr>
+                    <a:xfrm>
+                      <a:off x="0" y="0"/>
+                      <a:ext cx="6134335" cy="2907455"/>
+                    </a:xfrm>
+                    <a:prstGeom prst="rect">
+                      <a:avLst/>
+                    </a:prstGeom>
+                  </pic:spPr>
+                </pic:pic>
+              </a:graphicData>
+            </a:graphic>
+          </wp:inline>
+        </w:drawing>
       </w:r>
     </w:p>
     <w:sectPr>
@@ -721,6 +1077,56 @@
     </w:sectPr>
   </w:body>
 </w:document>
+</file>
+
+<file path=word/endnotes.xml><?xml version="1.0" encoding="utf-8"?>
+<w:endnotes xmlns:wpc="http://schemas.microsoft.com/office/word/2010/wordprocessingCanvas" xmlns:cx="http://schemas.microsoft.com/office/drawing/2014/chartex" xmlns:cx1="http://schemas.microsoft.com/office/drawing/2015/9/8/chartex" xmlns:cx2="http://schemas.microsoft.com/office/drawing/2015/10/21/chartex" xmlns:cx3="http://schemas.microsoft.com/office/drawing/2016/5/9/chartex" xmlns:cx4="http://schemas.microsoft.com/office/drawing/2016/5/10/chartex" xmlns:cx5="http://schemas.microsoft.com/office/drawing/2016/5/11/chartex" xmlns:cx6="http://schemas.microsoft.com/office/drawing/2016/5/12/chartex" xmlns:cx7="http://schemas.microsoft.com/office/drawing/2016/5/13/chartex" xmlns:cx8="http://schemas.microsoft.com/office/drawing/2016/5/14/chartex" xmlns:mc="http://schemas.openxmlformats.org/markup-compatibility/2006" xmlns:aink="http://schemas.microsoft.com/office/drawing/2016/ink" xmlns:am3d="http://schemas.microsoft.com/office/drawing/2017/model3d" xmlns:o="urn:schemas-microsoft-com:office:office" xmlns:oel="http://schemas.microsoft.com/office/2019/extlst" xmlns:r="http://schemas.openxmlformats.org/officeDocument/2006/relationships" xmlns:m="http://schemas.openxmlformats.org/officeDocument/2006/math" xmlns:v="urn:schemas-microsoft-com:vml" xmlns:wp14="http://schemas.microsoft.com/office/word/2010/wordprocessingDrawing" xmlns:wp="http://schemas.openxmlformats.org/drawingml/2006/wordprocessingDrawing" xmlns:w10="urn:schemas-microsoft-com:office:word" xmlns:w="http://schemas.openxmlformats.org/wordprocessingml/2006/main" xmlns:w14="http://schemas.microsoft.com/office/word/2010/wordml" xmlns:w15="http://schemas.microsoft.com/office/word/2012/wordml" xmlns:w16cex="http://schemas.microsoft.com/office/word/2018/wordml/cex" xmlns:w16cid="http://schemas.microsoft.com/office/word/2016/wordml/cid" xmlns:w16="http://schemas.microsoft.com/office/word/2018/wordml" xmlns:w16du="http://schemas.microsoft.com/office/word/2023/wordml/word16du" xmlns:w16sdtdh="http://schemas.microsoft.com/office/word/2020/wordml/sdtdatahash" xmlns:w16sdtfl="http://schemas.microsoft.com/office/word/2024/wordml/sdtformatlock" xmlns:w16se="http://schemas.microsoft.com/office/word/2015/wordml/symex" xmlns:wpg="http://schemas.microsoft.com/office/word/2010/wordprocessingGroup" xmlns:wpi="http://schemas.microsoft.com/office/word/2010/wordprocessingInk" xmlns:wne="http://schemas.microsoft.com/office/word/2006/wordml" xmlns:wps="http://schemas.microsoft.com/office/word/2010/wordprocessingShape" mc:Ignorable="w14 w15 w16se w16cid w16 w16cex w16sdtdh w16sdtfl w16du wp14">
+  <w:endnote w:type="separator" w:id="-1">
+    <w:p>
+      <w:pPr>
+        <w:spacing w:after="0" w:line="240" w:lineRule="auto"/>
+      </w:pPr>
+      <w:r>
+        <w:separator/>
+      </w:r>
+    </w:p>
+  </w:endnote>
+  <w:endnote w:type="continuationSeparator" w:id="0">
+    <w:p>
+      <w:pPr>
+        <w:spacing w:after="0" w:line="240" w:lineRule="auto"/>
+      </w:pPr>
+      <w:r>
+        <w:continuationSeparator/>
+      </w:r>
+    </w:p>
+  </w:endnote>
+</w:endnotes>
+</file>
+
+<file path=word/footnotes.xml><?xml version="1.0" encoding="utf-8"?>
+<w:footnotes xmlns:wpc="http://schemas.microsoft.com/office/word/2010/wordprocessingCanvas" xmlns:cx="http://schemas.microsoft.com/office/drawing/2014/chartex" xmlns:cx1="http://schemas.microsoft.com/office/drawing/2015/9/8/chartex" xmlns:cx2="http://schemas.microsoft.com/office/drawing/2015/10/21/chartex" xmlns:cx3="http://schemas.microsoft.com/office/drawing/2016/5/9/chartex" xmlns:cx4="http://schemas.microsoft.com/office/drawing/2016/5/10/chartex" xmlns:cx5="http://schemas.microsoft.com/office/drawing/2016/5/11/chartex" xmlns:cx6="http://schemas.microsoft.com/office/drawing/2016/5/12/chartex" xmlns:cx7="http://schemas.microsoft.com/office/drawing/2016/5/13/chartex" xmlns:cx8="http://schemas.microsoft.com/office/drawing/2016/5/14/chartex" xmlns:mc="http://schemas.openxmlformats.org/markup-compatibility/2006" xmlns:aink="http://schemas.microsoft.com/office/drawing/2016/ink" xmlns:am3d="http://schemas.microsoft.com/office/drawing/2017/model3d" xmlns:o="urn:schemas-microsoft-com:office:office" xmlns:oel="http://schemas.microsoft.com/office/2019/extlst" xmlns:r="http://schemas.openxmlformats.org/officeDocument/2006/relationships" xmlns:m="http://schemas.openxmlformats.org/officeDocument/2006/math" xmlns:v="urn:schemas-microsoft-com:vml" xmlns:wp14="http://schemas.microsoft.com/office/word/2010/wordprocessingDrawing" xmlns:wp="http://schemas.openxmlformats.org/drawingml/2006/wordprocessingDrawing" xmlns:w10="urn:schemas-microsoft-com:office:word" xmlns:w="http://schemas.openxmlformats.org/wordprocessingml/2006/main" xmlns:w14="http://schemas.microsoft.com/office/word/2010/wordml" xmlns:w15="http://schemas.microsoft.com/office/word/2012/wordml" xmlns:w16cex="http://schemas.microsoft.com/office/word/2018/wordml/cex" xmlns:w16cid="http://schemas.microsoft.com/office/word/2016/wordml/cid" xmlns:w16="http://schemas.microsoft.com/office/word/2018/wordml" xmlns:w16du="http://schemas.microsoft.com/office/word/2023/wordml/word16du" xmlns:w16sdtdh="http://schemas.microsoft.com/office/word/2020/wordml/sdtdatahash" xmlns:w16sdtfl="http://schemas.microsoft.com/office/word/2024/wordml/sdtformatlock" xmlns:w16se="http://schemas.microsoft.com/office/word/2015/wordml/symex" xmlns:wpg="http://schemas.microsoft.com/office/word/2010/wordprocessingGroup" xmlns:wpi="http://schemas.microsoft.com/office/word/2010/wordprocessingInk" xmlns:wne="http://schemas.microsoft.com/office/word/2006/wordml" xmlns:wps="http://schemas.microsoft.com/office/word/2010/wordprocessingShape" mc:Ignorable="w14 w15 w16se w16cid w16 w16cex w16sdtdh w16sdtfl w16du wp14">
+  <w:footnote w:type="separator" w:id="-1">
+    <w:p>
+      <w:pPr>
+        <w:spacing w:after="0" w:line="240" w:lineRule="auto"/>
+      </w:pPr>
+      <w:r>
+        <w:separator/>
+      </w:r>
+    </w:p>
+  </w:footnote>
+  <w:footnote w:type="continuationSeparator" w:id="0">
+    <w:p>
+      <w:pPr>
+        <w:spacing w:after="0" w:line="240" w:lineRule="auto"/>
+      </w:pPr>
+      <w:r>
+        <w:continuationSeparator/>
+      </w:r>
+    </w:p>
+  </w:footnote>
+</w:footnotes>
 </file>
 
 <file path=word/numbering.xml><?xml version="1.0" encoding="utf-8"?>
@@ -1617,6 +2023,7 @@
   <w:style w:type="character" w:default="1" w:styleId="DefaultParagraphFont">
     <w:name w:val="Default Paragraph Font"/>
     <w:uiPriority w:val="1"/>
+    <w:semiHidden/>
     <w:unhideWhenUsed/>
   </w:style>
   <w:style w:type="table" w:default="1" w:styleId="TableNormal">
@@ -1952,6 +2359,50 @@
       <w:color w:val="605E5C"/>
       <w:shd w:val="clear" w:color="auto" w:fill="E1DFDD"/>
     </w:rPr>
+  </w:style>
+  <w:style w:type="paragraph" w:styleId="Header">
+    <w:name w:val="header"/>
+    <w:basedOn w:val="Normal"/>
+    <w:link w:val="HeaderChar"/>
+    <w:uiPriority w:val="99"/>
+    <w:unhideWhenUsed/>
+    <w:rsid w:val="00CE791F"/>
+    <w:pPr>
+      <w:tabs>
+        <w:tab w:val="center" w:pos="4513"/>
+        <w:tab w:val="right" w:pos="9026"/>
+      </w:tabs>
+      <w:spacing w:after="0" w:line="240" w:lineRule="auto"/>
+    </w:pPr>
+  </w:style>
+  <w:style w:type="character" w:customStyle="1" w:styleId="HeaderChar">
+    <w:name w:val="Header Char"/>
+    <w:basedOn w:val="DefaultParagraphFont"/>
+    <w:link w:val="Header"/>
+    <w:uiPriority w:val="99"/>
+    <w:rsid w:val="00CE791F"/>
+  </w:style>
+  <w:style w:type="paragraph" w:styleId="Footer">
+    <w:name w:val="footer"/>
+    <w:basedOn w:val="Normal"/>
+    <w:link w:val="FooterChar"/>
+    <w:uiPriority w:val="99"/>
+    <w:unhideWhenUsed/>
+    <w:rsid w:val="00CE791F"/>
+    <w:pPr>
+      <w:tabs>
+        <w:tab w:val="center" w:pos="4513"/>
+        <w:tab w:val="right" w:pos="9026"/>
+      </w:tabs>
+      <w:spacing w:after="0" w:line="240" w:lineRule="auto"/>
+    </w:pPr>
+  </w:style>
+  <w:style w:type="character" w:customStyle="1" w:styleId="FooterChar">
+    <w:name w:val="Footer Char"/>
+    <w:basedOn w:val="DefaultParagraphFont"/>
+    <w:link w:val="Footer"/>
+    <w:uiPriority w:val="99"/>
+    <w:rsid w:val="00CE791F"/>
   </w:style>
 </w:styles>
 </file>

</xml_diff>